<commit_message>
feat(user-manual): enhance supervisor and ticket lifecycle documentation with call validation flow and detailed steps
</commit_message>
<xml_diff>
--- a/User Manual/docx-exports/Sales Side/Sales-Module-Manual.docx
+++ b/User Manual/docx-exports/Sales Side/Sales-Module-Manual.docx
@@ -72,6 +72,11 @@
         <w:t xml:space="preserve">The Sales role is responsible for accurate ticket intake, client call verification, priority setup, and post-handoff resolution monitoring until ticket completion.</w:t>
       </w:r>
     </w:p>
+    <w:p>
+      <w:r>
+        <w:br w:type="page"/>
+      </w:r>
+    </w:p>
     <w:bookmarkEnd w:id="9"/>
     <w:bookmarkStart w:id="10" w:name="module-list-sales"/>
     <w:p>
@@ -209,6 +214,11 @@
       </w:pPr>
       <w:r>
         <w:t xml:space="preserve">Sales Resolution Monitoring Workflow</w:t>
+      </w:r>
+    </w:p>
+    <w:p>
+      <w:r>
+        <w:br w:type="page"/>
       </w:r>
     </w:p>
     <w:bookmarkEnd w:id="10"/>
@@ -323,6 +333,11 @@
         <w:t xml:space="preserve">3. Confirm successful redirect to Sales dashboard.</w:t>
       </w:r>
     </w:p>
+    <w:p>
+      <w:r>
+        <w:br w:type="page"/>
+      </w:r>
+    </w:p>
     <w:bookmarkEnd w:id="14"/>
     <w:bookmarkStart w:id="18" w:name="dashboard-module"/>
     <w:p>
@@ -449,6 +464,11 @@
         <w:t xml:space="preserve">3. Open tickets requiring call verification completion.</w:t>
       </w:r>
     </w:p>
+    <w:p>
+      <w:r>
+        <w:br w:type="page"/>
+      </w:r>
+    </w:p>
     <w:bookmarkEnd w:id="18"/>
     <w:bookmarkStart w:id="57" w:name="create-ticket-module-core-sales-workflow"/>
     <w:p>
@@ -1456,6 +1476,11 @@
         <w:t xml:space="preserve">Flow Line H4: Monitor ticket in Sales views until closure.</w:t>
       </w:r>
     </w:p>
+    <w:p>
+      <w:r>
+        <w:br w:type="page"/>
+      </w:r>
+    </w:p>
     <w:bookmarkEnd w:id="56"/>
     <w:bookmarkEnd w:id="57"/>
     <w:bookmarkStart w:id="62" w:name="tickets-module"/>
@@ -1831,6 +1856,11 @@
         <w:t xml:space="preserve">in ticket history.</w:t>
       </w:r>
     </w:p>
+    <w:p>
+      <w:r>
+        <w:br w:type="page"/>
+      </w:r>
+    </w:p>
     <w:bookmarkEnd w:id="61"/>
     <w:bookmarkEnd w:id="62"/>
     <w:bookmarkStart w:id="69" w:name="clients-module"/>
@@ -2001,6 +2031,11 @@
         <w:t xml:space="preserve">4. Use view/edit/delete actions as needed.</w:t>
       </w:r>
     </w:p>
+    <w:p>
+      <w:r>
+        <w:br w:type="page"/>
+      </w:r>
+    </w:p>
     <w:bookmarkEnd w:id="69"/>
     <w:bookmarkStart w:id="76" w:name="products-module"/>
     <w:p>
@@ -2170,6 +2205,11 @@
         <w:t xml:space="preserve">4. Save and verify catalog entry.</w:t>
       </w:r>
     </w:p>
+    <w:p>
+      <w:r>
+        <w:br w:type="page"/>
+      </w:r>
+    </w:p>
     <w:bookmarkEnd w:id="76"/>
     <w:bookmarkStart w:id="83" w:name="deviceequipment-category-module"/>
     <w:p>
@@ -2321,6 +2361,11 @@
         <w:t xml:space="preserve">3. Activate/deactivate categories as needed.</w:t>
       </w:r>
     </w:p>
+    <w:p>
+      <w:r>
+        <w:br w:type="page"/>
+      </w:r>
+    </w:p>
     <w:bookmarkEnd w:id="83"/>
     <w:bookmarkStart w:id="90" w:name="types-of-service-module"/>
     <w:p>
@@ -2466,6 +2511,11 @@
         <w:t xml:space="preserve">2. Ensure selected service type aligns with client issue.</w:t>
       </w:r>
     </w:p>
+    <w:p>
+      <w:r>
+        <w:br w:type="page"/>
+      </w:r>
+    </w:p>
     <w:bookmarkEnd w:id="90"/>
     <w:bookmarkStart w:id="97" w:name="closing-and-completed-tickets-views"/>
     <w:p>
@@ -2735,6 +2785,11 @@
         <w:t xml:space="preserve">- Flow Line C4: Sales confirms final outcome and communicates completion to stakeholders as needed.</w:t>
       </w:r>
     </w:p>
+    <w:p>
+      <w:r>
+        <w:br w:type="page"/>
+      </w:r>
+    </w:p>
     <w:bookmarkEnd w:id="97"/>
     <w:bookmarkStart w:id="98" w:name="data-accuracy-rules-for-sales"/>
     <w:p>
@@ -2802,6 +2857,11 @@
         <w:t xml:space="preserve">Confirm priority after call verification before final handoff.</w:t>
       </w:r>
     </w:p>
+    <w:p>
+      <w:r>
+        <w:br w:type="page"/>
+      </w:r>
+    </w:p>
     <w:bookmarkEnd w:id="98"/>
     <w:bookmarkStart w:id="99" w:name="sales-workflow-summary-lines"/>
     <w:p>
@@ -2891,6 +2951,11 @@
       </w:pPr>
       <w:r>
         <w:t xml:space="preserve">Flow Line S9: Confirm finalized result in Completed Tickets.</w:t>
+      </w:r>
+    </w:p>
+    <w:p>
+      <w:r>
+        <w:br w:type="page"/>
       </w:r>
     </w:p>
     <w:bookmarkEnd w:id="99"/>

</xml_diff>